<commit_message>
Preserve embedded illustrations in working drafts
</commit_message>
<xml_diff>
--- a/livis-base-drafts/Livis_Chinese_Base_Draft.docx
+++ b/livis-base-drafts/Livis_Chinese_Base_Draft.docx
@@ -56,7 +56,9 @@
       </w:r>
     </w:p>
     <w:p>
-      <w:r/>
+      <w:r>
+        <w:br w:type="page"/>
+      </w:r>
     </w:p>
     <w:p>
       <w:pPr>
@@ -532,6 +534,9 @@
         </w:pBdr>
       </w:pPr>
       <w:r>
+        <w:rPr>
+          <w:color w:val="36586B"/>
+        </w:rPr>
         <w:t>表中按功能与条件分类，便于先确认手机、网络和车辆兼容要求。拍摄、音频及AI集成在同一副眼镜中，是产品的主要使用特点。</w:t>
       </w:r>
     </w:p>
@@ -540,7 +545,40 @@
         <w:keepNext/>
         <w:ind w:firstLine="0"/>
       </w:pPr>
-      <w:r/>
+      <w:r>
+        <w:drawing>
+          <wp:inline xmlns:a="http://schemas.openxmlformats.org/drawingml/2006/main" xmlns:pic="http://schemas.openxmlformats.org/drawingml/2006/picture">
+            <wp:extent cx="5760000" cy="2880000"/>
+            <wp:docPr id="1" name="Picture 1"/>
+            <wp:cNvGraphicFramePr>
+              <a:graphicFrameLocks noChangeAspect="1"/>
+            </wp:cNvGraphicFramePr>
+            <a:graphic>
+              <a:graphicData uri="http://schemas.openxmlformats.org/drawingml/2006/picture">
+                <pic:pic>
+                  <pic:nvPicPr>
+                    <pic:cNvPr id="0" name="image.png"/>
+                    <pic:cNvPicPr/>
+                  </pic:nvPicPr>
+                  <pic:blipFill>
+                    <a:blip r:embed="rId11"/>
+                    <a:stretch>
+                      <a:fillRect/>
+                    </a:stretch>
+                  </pic:blipFill>
+                  <pic:spPr>
+                    <a:xfrm>
+                      <a:off x="0" y="0"/>
+                      <a:ext cx="5760000" cy="2880000"/>
+                    </a:xfrm>
+                    <a:prstGeom prst="rect"/>
+                  </pic:spPr>
+                </pic:pic>
+              </a:graphicData>
+            </a:graphic>
+          </wp:inline>
+        </w:drawing>
+      </w:r>
     </w:p>
     <w:p>
       <w:r>
@@ -555,6 +593,9 @@
         </w:pBdr>
       </w:pPr>
       <w:r>
+        <w:rPr>
+          <w:color w:val="36586B"/>
+        </w:rPr>
         <w:t>这幅场景图将拍摄、语音辅助和手机查看联系起来，帮助理解眼镜与手机的分工。可佩戴交互减少了部分操作对手持设备的依赖；具体服务仍需满足地区和账号条件。</w:t>
       </w:r>
     </w:p>
@@ -623,7 +664,40 @@
         <w:keepNext/>
         <w:ind w:firstLine="0"/>
       </w:pPr>
-      <w:r/>
+      <w:r>
+        <w:drawing>
+          <wp:inline xmlns:a="http://schemas.openxmlformats.org/drawingml/2006/main" xmlns:pic="http://schemas.openxmlformats.org/drawingml/2006/picture">
+            <wp:extent cx="5760000" cy="1794257"/>
+            <wp:docPr id="2" name="Picture 2"/>
+            <wp:cNvGraphicFramePr>
+              <a:graphicFrameLocks noChangeAspect="1"/>
+            </wp:cNvGraphicFramePr>
+            <a:graphic>
+              <a:graphicData uri="http://schemas.openxmlformats.org/drawingml/2006/picture">
+                <pic:pic>
+                  <pic:nvPicPr>
+                    <pic:cNvPr id="0" name="image.png"/>
+                    <pic:cNvPicPr/>
+                  </pic:nvPicPr>
+                  <pic:blipFill>
+                    <a:blip r:embed="rId12"/>
+                    <a:stretch>
+                      <a:fillRect/>
+                    </a:stretch>
+                  </pic:blipFill>
+                  <pic:spPr>
+                    <a:xfrm>
+                      <a:off x="0" y="0"/>
+                      <a:ext cx="5760000" cy="1794257"/>
+                    </a:xfrm>
+                    <a:prstGeom prst="rect"/>
+                  </pic:spPr>
+                </pic:pic>
+              </a:graphicData>
+            </a:graphic>
+          </wp:inline>
+        </w:drawing>
+      </w:r>
     </w:p>
     <w:p>
       <w:r>
@@ -638,6 +712,9 @@
         </w:pBdr>
       </w:pPr>
       <w:r>
+        <w:rPr>
+          <w:color w:val="36586B"/>
+        </w:rPr>
         <w:t>图中三视图用于识别外形和尺寸，便于购买前评估佩戴适配。36 g仅镜架重量体现轻量设计，但舒适度还取决于镜片重量和个人脸型，不能只凭尺寸判断。</w:t>
       </w:r>
     </w:p>
@@ -844,6 +921,9 @@
         </w:pBdr>
       </w:pPr>
       <w:r>
+        <w:rPr>
+          <w:color w:val="36586B"/>
+        </w:rPr>
         <w:t>表中把每种手势与当前功能对应，便于在不查看手机时完成常用操作。实际用途随播放、通话或录音状态改变，应先确认当前状态。</w:t>
       </w:r>
     </w:p>
@@ -1234,6 +1314,9 @@
         </w:pBdr>
       </w:pPr>
       <w:r>
+        <w:rPr>
+          <w:color w:val="36586B"/>
+        </w:rPr>
         <w:t>表中区分仅镜架重量和佩戴尺寸，避免把36 g误当作含镜片重量。TR90镜架、钛合金转轴及硅胶鼻托体现轻量与佩戴适配的设计方向。</w:t>
       </w:r>
     </w:p>
@@ -1255,7 +1338,40 @@
         <w:keepNext/>
         <w:ind w:firstLine="0"/>
       </w:pPr>
-      <w:r/>
+      <w:r>
+        <w:drawing>
+          <wp:inline xmlns:a="http://schemas.openxmlformats.org/drawingml/2006/main" xmlns:pic="http://schemas.openxmlformats.org/drawingml/2006/picture">
+            <wp:extent cx="5760000" cy="2671939"/>
+            <wp:docPr id="3" name="Picture 3"/>
+            <wp:cNvGraphicFramePr>
+              <a:graphicFrameLocks noChangeAspect="1"/>
+            </wp:cNvGraphicFramePr>
+            <a:graphic>
+              <a:graphicData uri="http://schemas.openxmlformats.org/drawingml/2006/picture">
+                <pic:pic>
+                  <pic:nvPicPr>
+                    <pic:cNvPr id="0" name="image.png"/>
+                    <pic:cNvPicPr/>
+                  </pic:nvPicPr>
+                  <pic:blipFill>
+                    <a:blip r:embed="rId13"/>
+                    <a:stretch>
+                      <a:fillRect/>
+                    </a:stretch>
+                  </pic:blipFill>
+                  <pic:spPr>
+                    <a:xfrm>
+                      <a:off x="0" y="0"/>
+                      <a:ext cx="5760000" cy="2671939"/>
+                    </a:xfrm>
+                    <a:prstGeom prst="rect"/>
+                  </pic:spPr>
+                </pic:pic>
+              </a:graphicData>
+            </a:graphic>
+          </wp:inline>
+        </w:drawing>
+      </w:r>
     </w:p>
     <w:p>
       <w:r>
@@ -1270,6 +1386,9 @@
         </w:pBdr>
       </w:pPr>
       <w:r>
+        <w:rPr>
+          <w:color w:val="36586B"/>
+        </w:rPr>
         <w:t>配色图帮助选择外观和镜片搭配，展示经典黑、科技灰与橄榄绿等配置。颜色和表面处理属于外观差异，不表示功能或防护性能不同，选购以实际订单为准。</w:t>
       </w:r>
     </w:p>
@@ -1702,6 +1821,9 @@
         </w:pBdr>
       </w:pPr>
       <w:r>
+        <w:rPr>
+          <w:color w:val="36586B"/>
+        </w:rPr>
         <w:t>1200万像素照片、1080p视频和EIS为日常第一视角记录提供基础。表中的单段时长与画幅便于选择记录方式；成像效果仍受光线和稳定程度影响。</w:t>
       </w:r>
     </w:p>
@@ -1967,6 +2089,9 @@
         </w:pBdr>
       </w:pPr>
       <w:r>
+        <w:rPr>
+          <w:color w:val="36586B"/>
+        </w:rPr>
         <w:t>开放式音频与双设备连接有助于在日常播放和通话间切换。表中分别列出同时连接与保留绑定数量，避免把八台绑定理解为八台同时播放。</w:t>
       </w:r>
     </w:p>
@@ -2461,6 +2586,9 @@
         </w:pBdr>
       </w:pPr>
       <w:r>
+        <w:rPr>
+          <w:color w:val="36586B"/>
+        </w:rPr>
         <w:t>表中分开眼镜和充电盒的充电时间，方便规划外出补能。有线与Qi无线两种方式提供不同充电选择；续航、录像时长和盒内补能次数不应相加。</w:t>
       </w:r>
     </w:p>
@@ -2951,6 +3079,9 @@
         </w:pBdr>
       </w:pPr>
       <w:r>
+        <w:rPr>
+          <w:color w:val="36586B"/>
+        </w:rPr>
         <w:t>检查表将连接、佩戴、音频、拍摄和隐私逐项确认，帮助在正式使用前发现设置问题。完成测试后再进入日常操作，能减少首次使用时的遗漏。</w:t>
       </w:r>
     </w:p>
@@ -6212,6 +6343,9 @@
         </w:pBdr>
       </w:pPr>
       <w:r>
+        <w:rPr>
+          <w:color w:val="36586B"/>
+        </w:rPr>
         <w:t>这份信息表用于提高售后沟通效率。清楚描述版本、故障和已尝试步骤，有助于支持人员判断问题，避免反复询问；不应提供账号密码。</w:t>
       </w:r>
     </w:p>

</xml_diff>